<commit_message>
docs: 기획문서 재구성 — auth/order/settlement spec 분리 및 store/dashboard 업데이트
- spec_auth, spec_order, spec_settlement 기존 파일 삭제 후 추가/검토 문서로 분리
- spec_store: 계약정보 재분류(본사↔매장), 소상권 자동 생성 반경 모드 전용 반영
- spec_dashboard: 차트/분석 기획 업데이트
- docx 원본 파일 동기화

Co-Authored-By: Claude Opus 4.6 <noreply@anthropic.com>
</commit_message>
<xml_diff>
--- a/docs/01.plan/spec_dashboard.docx
+++ b/docs/01.plan/spec_dashboard.docx
@@ -311,7 +311,7 @@
         <w:rPr>
           <w:sz w:val="20"/>
         </w:rPr>
-        <w:t>핵심 통계 카드 — 전체 주문 금액, 전체 주문 수, 최소 주문 건수, 신규 가입 회원 수, 엑셀 다운로드 기능을 상단에 표시한다.</w:t>
+        <w:t>핵심 통계 카드 — 전체 주문 금액(`todayRevenue`), 전체 주문 수(`todayOrders`), 등록 가맹점 수(`totalStores`), 신규 가입 회원 수(`newSignupNormal + newSignupSimple`)를 상단에 표시한다. `useDashboard` → `DashboardStats` 기반.</w:t>
       </w:r>
     </w:p>
     <w:p>
@@ -322,7 +322,7 @@
         <w:rPr>
           <w:sz w:val="20"/>
         </w:rPr>
-        <w:t>정보 카드 — 매출 현황, 회원 현황, 문의 현황 등 섹션별 요약 정보와 바로가기 버튼을 제공한다.</w:t>
+        <w:t>정보 카드 — 매출 현황(전체/완료/취소 금액), 회원 현황(전체/신규일반/신규간편/탈퇴), 문의 현황(대기`pending`/완료`resolved`) 등 섹션별 요약 정보와 바로가기 버튼을 제공한다. `DashboardStats` 기반.</w:t>
       </w:r>
     </w:p>
     <w:p>
@@ -333,7 +333,7 @@
         <w:rPr>
           <w:sz w:val="20"/>
         </w:rPr>
-        <w:t>차트 — 일별 매출 추이(`DailySalesChart`), 주문 상세(`OrderDetailsChart`), 회원 분석(`MemberAnalytics`), 마케팅 성과(`MarketingPerformance`)를 시각화한다.</w:t>
+        <w:t>주문 상세 차트 — 주문 유형별/채널별/결제수단별/회원별 비율을 탭으로 전환하여 표시한다. `useOrderDetails` hook 연동.</w:t>
       </w:r>
     </w:p>
     <w:p>
@@ -344,7 +344,29 @@
         <w:rPr>
           <w:sz w:val="20"/>
         </w:rPr>
-        <w:t>최근 접속 이력 — 관리자 최근 로그인 이력(`RecentLogins`)을 테이블로 표시한다.</w:t>
+        <w:t>일별 매출 차트 — 선택 기간의 일별 매출 추이를 막대 차트로 표시한다. `useDailySales(dateRange)` hook 연동. 기간 변경 시 자동 재조회.</w:t>
+      </w:r>
+    </w:p>
+    <w:p>
+      <w:pPr>
+        <w:pStyle w:val="ListNumber"/>
+      </w:pPr>
+      <w:r>
+        <w:rPr>
+          <w:sz w:val="20"/>
+        </w:rPr>
+        <w:t>회원 분석 — 회원 상태 요약, 성별/연령대 분포, 등급별 구성, 성장 지표, Top5 고객, 주문 빈도를 표시한다. `useMemberAnalytics` hook 연동.</w:t>
+      </w:r>
+    </w:p>
+    <w:p>
+      <w:pPr>
+        <w:pStyle w:val="ListNumber"/>
+      </w:pPr>
+      <w:r>
+        <w:rPr>
+          <w:sz w:val="20"/>
+        </w:rPr>
+        <w:t>마케팅 성과 — 배너/이벤트별 노출·클릭·전환율을 테이블로 표시한다. `useMarketingStats` hook 연동.</w:t>
       </w:r>
     </w:p>
     <w:p>
@@ -356,39 +378,6 @@
           <w:sz w:val="20"/>
         </w:rPr>
         <w:t>GA4 통계 — 디바이스별 상세(`GA4DeviceDetail`), 퍼널 분석(`GA4FunnelDetail`) 컴포넌트를 제공한다.</w:t>
-      </w:r>
-    </w:p>
-    <w:p>
-      <w:pPr>
-        <w:pStyle w:val="ListNumber"/>
-      </w:pPr>
-      <w:r>
-        <w:rPr>
-          <w:sz w:val="20"/>
-        </w:rPr>
-        <w:t>기능 사용 방법 (UI Interaction)</w:t>
-      </w:r>
-    </w:p>
-    <w:p>
-      <w:pPr>
-        <w:pStyle w:val="ListBullet"/>
-      </w:pPr>
-      <w:r>
-        <w:rPr>
-          <w:sz w:val="20"/>
-        </w:rPr>
-        <w:t>기간 필터 조작 시 브라우저 내 상태(State)가 변경되며 즉시 `useDashboard` 훅을 통해 데이터 재조회 요청이 발생합니다.</w:t>
-      </w:r>
-    </w:p>
-    <w:p>
-      <w:pPr>
-        <w:pStyle w:val="ListBullet"/>
-      </w:pPr>
-      <w:r>
-        <w:rPr>
-          <w:sz w:val="20"/>
-        </w:rPr>
-        <w:t>우측 상단의 엑셀 다운로드 버튼 클릭 시 현재 선택된 기간 필터값을 기반으로 대시보드상 노출된 주요 통계 및 시계열 매출/마케팅 성과 데이터가 단일 Excel 파일로 클라이언트에서 생성 후 자동 다운로드됩니다.</w:t>
       </w:r>
     </w:p>
     <w:p>
@@ -498,7 +487,7 @@
                 <w:color w:val="FFFFFF"/>
                 <w:sz w:val="18"/>
               </w:rPr>
-              <w:t>글자수 / 제약조건</w:t>
+              <w:t>데이터 소스</w:t>
             </w:r>
           </w:p>
         </w:tc>
@@ -580,7 +569,7 @@
               <w:rPr>
                 <w:sz w:val="18"/>
               </w:rPr>
-              <w:t>preset + from/to</w:t>
+              <w:t>로컬 state</w:t>
             </w:r>
           </w:p>
         </w:tc>
@@ -595,7 +584,7 @@
               <w:rPr>
                 <w:sz w:val="18"/>
               </w:rPr>
-              <w:t>오늘/어제/7일/30일/직접입력이다.</w:t>
+              <w:t>오늘/어제/7일/30일/직접입력. 변경 시 전체 데이터 재조회.</w:t>
             </w:r>
           </w:p>
         </w:tc>
@@ -611,7 +600,7 @@
               <w:rPr>
                 <w:sz w:val="18"/>
               </w:rPr>
-              <w:t>전체 주문 금액 (totalRevenue)</w:t>
+              <w:t>전체 주문 금액</w:t>
             </w:r>
           </w:p>
         </w:tc>
@@ -653,7 +642,7 @@
               <w:rPr>
                 <w:sz w:val="18"/>
               </w:rPr>
-              <w:t>통화 포맷</w:t>
+              <w:t>`stats.todayRevenue`</w:t>
             </w:r>
           </w:p>
         </w:tc>
@@ -667,7 +656,7 @@
               <w:rPr>
                 <w:sz w:val="18"/>
               </w:rPr>
-              <w:t>전체 주문 금액을 표시한다.</w:t>
+              <w:t>통화 포맷 표시.</w:t>
             </w:r>
           </w:p>
         </w:tc>
@@ -684,7 +673,7 @@
               <w:rPr>
                 <w:sz w:val="18"/>
               </w:rPr>
-              <w:t>전체 주문 수 (totalOrders)</w:t>
+              <w:t>전체 주문 수</w:t>
             </w:r>
           </w:p>
         </w:tc>
@@ -729,7 +718,7 @@
               <w:rPr>
                 <w:sz w:val="18"/>
               </w:rPr>
-              <w:t>숫자</w:t>
+              <w:t>`stats.todayOrders`</w:t>
             </w:r>
           </w:p>
         </w:tc>
@@ -744,7 +733,7 @@
               <w:rPr>
                 <w:sz w:val="18"/>
               </w:rPr>
-              <w:t>전체 주문 건수를 표시한다.</w:t>
+              <w:t>숫자 표시.</w:t>
             </w:r>
           </w:p>
         </w:tc>
@@ -760,7 +749,7 @@
               <w:rPr>
                 <w:sz w:val="18"/>
               </w:rPr>
-              <w:t>최소 주문 건수 (minOrders)</w:t>
+              <w:t>등록 가맹점 수</w:t>
             </w:r>
           </w:p>
         </w:tc>
@@ -802,7 +791,7 @@
               <w:rPr>
                 <w:sz w:val="18"/>
               </w:rPr>
-              <w:t>숫자</w:t>
+              <w:t>`stats.totalStores`</w:t>
             </w:r>
           </w:p>
         </w:tc>
@@ -816,7 +805,7 @@
               <w:rPr>
                 <w:sz w:val="18"/>
               </w:rPr>
-              <w:t>최소 주문 건수를 표시한다.</w:t>
+              <w:t>숫자 표시.</w:t>
             </w:r>
           </w:p>
         </w:tc>
@@ -833,7 +822,7 @@
               <w:rPr>
                 <w:sz w:val="18"/>
               </w:rPr>
-              <w:t>신규 가입 회원 수 (newMembers)</w:t>
+              <w:t>신규 가입 회원 수</w:t>
             </w:r>
           </w:p>
         </w:tc>
@@ -878,7 +867,7 @@
               <w:rPr>
                 <w:sz w:val="18"/>
               </w:rPr>
-              <w:t>숫자</w:t>
+              <w:t>`stats.newSignupNormal + newSignupSimple`</w:t>
             </w:r>
           </w:p>
         </w:tc>
@@ -893,7 +882,7 @@
               <w:rPr>
                 <w:sz w:val="18"/>
               </w:rPr>
-              <w:t>신규 가입한 회원의 수를 표시한다.</w:t>
+              <w:t>일반+간편 합산 표시.</w:t>
             </w:r>
           </w:p>
         </w:tc>
@@ -909,7 +898,7 @@
               <w:rPr>
                 <w:sz w:val="18"/>
               </w:rPr>
-              <w:t>엑셀 다운로드</w:t>
+              <w:t>매출 현황 InfoCard</w:t>
             </w:r>
           </w:p>
         </w:tc>
@@ -923,7 +912,7 @@
               <w:rPr>
                 <w:sz w:val="18"/>
               </w:rPr>
-              <w:t>Button</w:t>
+              <w:t>Card</w:t>
             </w:r>
           </w:p>
         </w:tc>
@@ -951,7 +940,7 @@
               <w:rPr>
                 <w:sz w:val="18"/>
               </w:rPr>
-              <w:t>-</w:t>
+              <w:t>`stats.todayRevenue / todayCompletedRevenue / todayCancelledRevenue`</w:t>
             </w:r>
           </w:p>
         </w:tc>
@@ -965,7 +954,7 @@
               <w:rPr>
                 <w:sz w:val="18"/>
               </w:rPr>
-              <w:t>대시보드 데이터를 Excel 파일로 내보내기한다.</w:t>
+              <w:t>전체/완료/취소 금액.</w:t>
             </w:r>
           </w:p>
         </w:tc>
@@ -982,7 +971,7 @@
               <w:rPr>
                 <w:sz w:val="18"/>
               </w:rPr>
-              <w:t>정보 카드 (InfoCard)</w:t>
+              <w:t>회원 현황 InfoCard</w:t>
             </w:r>
           </w:p>
         </w:tc>
@@ -1027,7 +1016,7 @@
               <w:rPr>
                 <w:sz w:val="18"/>
               </w:rPr>
-              <w:t>-</w:t>
+              <w:t>`stats.totalMembers / newSignupNormal / newSignupSimple / withdrawalCount`</w:t>
             </w:r>
           </w:p>
         </w:tc>
@@ -1042,7 +1031,377 @@
               <w:rPr>
                 <w:sz w:val="18"/>
               </w:rPr>
-              <w:t>섹션별 통계 요약과 바로가기 버튼이다.</w:t>
+              <w:t>전체/일반가입/간편가입/탈퇴.</w:t>
+            </w:r>
+          </w:p>
+        </w:tc>
+      </w:tr>
+      <w:tr>
+        <w:tc>
+          <w:tcPr>
+            <w:tcW w:type="dxa" w:w="2268"/>
+          </w:tcPr>
+          <w:p>
+            <w:r/>
+            <w:r>
+              <w:rPr>
+                <w:sz w:val="18"/>
+              </w:rPr>
+              <w:t>문의 현황 InfoCard</w:t>
+            </w:r>
+          </w:p>
+        </w:tc>
+        <w:tc>
+          <w:tcPr>
+            <w:tcW w:type="dxa" w:w="1417"/>
+          </w:tcPr>
+          <w:p>
+            <w:r/>
+            <w:r>
+              <w:rPr>
+                <w:sz w:val="18"/>
+              </w:rPr>
+              <w:t>Card</w:t>
+            </w:r>
+          </w:p>
+        </w:tc>
+        <w:tc>
+          <w:tcPr>
+            <w:tcW w:type="dxa" w:w="850"/>
+          </w:tcPr>
+          <w:p>
+            <w:r/>
+            <w:r>
+              <w:rPr>
+                <w:sz w:val="18"/>
+              </w:rPr>
+              <w:t>-</w:t>
+            </w:r>
+          </w:p>
+        </w:tc>
+        <w:tc>
+          <w:tcPr>
+            <w:tcW w:type="dxa" w:w="1984"/>
+          </w:tcPr>
+          <w:p>
+            <w:r/>
+            <w:r>
+              <w:rPr>
+                <w:sz w:val="18"/>
+              </w:rPr>
+              <w:t>`stats.pendingInquiries / resolvedInquiries`</w:t>
+            </w:r>
+          </w:p>
+        </w:tc>
+        <w:tc>
+          <w:tcPr>
+            <w:tcW w:type="dxa" w:w="3118"/>
+          </w:tcPr>
+          <w:p>
+            <w:r/>
+            <w:r>
+              <w:rPr>
+                <w:sz w:val="18"/>
+              </w:rPr>
+              <w:t>대기/완료. (InquiryStatus: pending/resolved)</w:t>
+            </w:r>
+          </w:p>
+        </w:tc>
+      </w:tr>
+      <w:tr>
+        <w:tc>
+          <w:tcPr>
+            <w:tcW w:type="dxa" w:w="2268"/>
+            <w:shd w:val="clear" w:color="auto" w:fill="F5F7FA"/>
+          </w:tcPr>
+          <w:p>
+            <w:r/>
+            <w:r>
+              <w:rPr>
+                <w:sz w:val="18"/>
+              </w:rPr>
+              <w:t>주문 상세 차트</w:t>
+            </w:r>
+          </w:p>
+        </w:tc>
+        <w:tc>
+          <w:tcPr>
+            <w:tcW w:type="dxa" w:w="1417"/>
+            <w:shd w:val="clear" w:color="auto" w:fill="F5F7FA"/>
+          </w:tcPr>
+          <w:p>
+            <w:r/>
+            <w:r>
+              <w:rPr>
+                <w:sz w:val="18"/>
+              </w:rPr>
+              <w:t>OrderDetailsChart</w:t>
+            </w:r>
+          </w:p>
+        </w:tc>
+        <w:tc>
+          <w:tcPr>
+            <w:tcW w:type="dxa" w:w="850"/>
+            <w:shd w:val="clear" w:color="auto" w:fill="F5F7FA"/>
+          </w:tcPr>
+          <w:p>
+            <w:r/>
+            <w:r>
+              <w:rPr>
+                <w:sz w:val="18"/>
+              </w:rPr>
+              <w:t>-</w:t>
+            </w:r>
+          </w:p>
+        </w:tc>
+        <w:tc>
+          <w:tcPr>
+            <w:tcW w:type="dxa" w:w="1984"/>
+            <w:shd w:val="clear" w:color="auto" w:fill="F5F7FA"/>
+          </w:tcPr>
+          <w:p>
+            <w:r/>
+            <w:r>
+              <w:rPr>
+                <w:sz w:val="18"/>
+              </w:rPr>
+              <w:t>`useOrderDetails` → `OrderDetailsData`</w:t>
+            </w:r>
+          </w:p>
+        </w:tc>
+        <w:tc>
+          <w:tcPr>
+            <w:tcW w:type="dxa" w:w="3118"/>
+            <w:shd w:val="clear" w:color="auto" w:fill="F5F7FA"/>
+          </w:tcPr>
+          <w:p>
+            <w:r/>
+            <w:r>
+              <w:rPr>
+                <w:sz w:val="18"/>
+              </w:rPr>
+              <w:t>유형/채널/결제/회원별 탭 전환.</w:t>
+            </w:r>
+          </w:p>
+        </w:tc>
+      </w:tr>
+      <w:tr>
+        <w:tc>
+          <w:tcPr>
+            <w:tcW w:type="dxa" w:w="2268"/>
+          </w:tcPr>
+          <w:p>
+            <w:r/>
+            <w:r>
+              <w:rPr>
+                <w:sz w:val="18"/>
+              </w:rPr>
+              <w:t>일별 매출 차트</w:t>
+            </w:r>
+          </w:p>
+        </w:tc>
+        <w:tc>
+          <w:tcPr>
+            <w:tcW w:type="dxa" w:w="1417"/>
+          </w:tcPr>
+          <w:p>
+            <w:r/>
+            <w:r>
+              <w:rPr>
+                <w:sz w:val="18"/>
+              </w:rPr>
+              <w:t>DailySalesChart</w:t>
+            </w:r>
+          </w:p>
+        </w:tc>
+        <w:tc>
+          <w:tcPr>
+            <w:tcW w:type="dxa" w:w="850"/>
+          </w:tcPr>
+          <w:p>
+            <w:r/>
+            <w:r>
+              <w:rPr>
+                <w:sz w:val="18"/>
+              </w:rPr>
+              <w:t>-</w:t>
+            </w:r>
+          </w:p>
+        </w:tc>
+        <w:tc>
+          <w:tcPr>
+            <w:tcW w:type="dxa" w:w="1984"/>
+          </w:tcPr>
+          <w:p>
+            <w:r/>
+            <w:r>
+              <w:rPr>
+                <w:sz w:val="18"/>
+              </w:rPr>
+              <w:t>`useDailySales(dateRange)` → `DailySalesItem[]`</w:t>
+            </w:r>
+          </w:p>
+        </w:tc>
+        <w:tc>
+          <w:tcPr>
+            <w:tcW w:type="dxa" w:w="3118"/>
+          </w:tcPr>
+          <w:p>
+            <w:r/>
+            <w:r>
+              <w:rPr>
+                <w:sz w:val="18"/>
+              </w:rPr>
+              <w:t>기간 연동 막대 차트.</w:t>
+            </w:r>
+          </w:p>
+        </w:tc>
+      </w:tr>
+      <w:tr>
+        <w:tc>
+          <w:tcPr>
+            <w:tcW w:type="dxa" w:w="2268"/>
+            <w:shd w:val="clear" w:color="auto" w:fill="F5F7FA"/>
+          </w:tcPr>
+          <w:p>
+            <w:r/>
+            <w:r>
+              <w:rPr>
+                <w:sz w:val="18"/>
+              </w:rPr>
+              <w:t>회원 분석</w:t>
+            </w:r>
+          </w:p>
+        </w:tc>
+        <w:tc>
+          <w:tcPr>
+            <w:tcW w:type="dxa" w:w="1417"/>
+            <w:shd w:val="clear" w:color="auto" w:fill="F5F7FA"/>
+          </w:tcPr>
+          <w:p>
+            <w:r/>
+            <w:r>
+              <w:rPr>
+                <w:sz w:val="18"/>
+              </w:rPr>
+              <w:t>MemberAnalytics</w:t>
+            </w:r>
+          </w:p>
+        </w:tc>
+        <w:tc>
+          <w:tcPr>
+            <w:tcW w:type="dxa" w:w="850"/>
+            <w:shd w:val="clear" w:color="auto" w:fill="F5F7FA"/>
+          </w:tcPr>
+          <w:p>
+            <w:r/>
+            <w:r>
+              <w:rPr>
+                <w:sz w:val="18"/>
+              </w:rPr>
+              <w:t>-</w:t>
+            </w:r>
+          </w:p>
+        </w:tc>
+        <w:tc>
+          <w:tcPr>
+            <w:tcW w:type="dxa" w:w="1984"/>
+            <w:shd w:val="clear" w:color="auto" w:fill="F5F7FA"/>
+          </w:tcPr>
+          <w:p>
+            <w:r/>
+            <w:r>
+              <w:rPr>
+                <w:sz w:val="18"/>
+              </w:rPr>
+              <w:t>`useMemberAnalytics` → `MemberAnalyticsData`</w:t>
+            </w:r>
+          </w:p>
+        </w:tc>
+        <w:tc>
+          <w:tcPr>
+            <w:tcW w:type="dxa" w:w="3118"/>
+            <w:shd w:val="clear" w:color="auto" w:fill="F5F7FA"/>
+          </w:tcPr>
+          <w:p>
+            <w:r/>
+            <w:r>
+              <w:rPr>
+                <w:sz w:val="18"/>
+              </w:rPr>
+              <w:t>요약/성별/연령/등급/성장/Top5/빈도.</w:t>
+            </w:r>
+          </w:p>
+        </w:tc>
+      </w:tr>
+      <w:tr>
+        <w:tc>
+          <w:tcPr>
+            <w:tcW w:type="dxa" w:w="2268"/>
+          </w:tcPr>
+          <w:p>
+            <w:r/>
+            <w:r>
+              <w:rPr>
+                <w:sz w:val="18"/>
+              </w:rPr>
+              <w:t>마케팅 성과</w:t>
+            </w:r>
+          </w:p>
+        </w:tc>
+        <w:tc>
+          <w:tcPr>
+            <w:tcW w:type="dxa" w:w="1417"/>
+          </w:tcPr>
+          <w:p>
+            <w:r/>
+            <w:r>
+              <w:rPr>
+                <w:sz w:val="18"/>
+              </w:rPr>
+              <w:t>MarketingPerformance</w:t>
+            </w:r>
+          </w:p>
+        </w:tc>
+        <w:tc>
+          <w:tcPr>
+            <w:tcW w:type="dxa" w:w="850"/>
+          </w:tcPr>
+          <w:p>
+            <w:r/>
+            <w:r>
+              <w:rPr>
+                <w:sz w:val="18"/>
+              </w:rPr>
+              <w:t>-</w:t>
+            </w:r>
+          </w:p>
+        </w:tc>
+        <w:tc>
+          <w:tcPr>
+            <w:tcW w:type="dxa" w:w="1984"/>
+          </w:tcPr>
+          <w:p>
+            <w:r/>
+            <w:r>
+              <w:rPr>
+                <w:sz w:val="18"/>
+              </w:rPr>
+              <w:t>`useMarketingStats` → `MarketingStats`</w:t>
+            </w:r>
+          </w:p>
+        </w:tc>
+        <w:tc>
+          <w:tcPr>
+            <w:tcW w:type="dxa" w:w="3118"/>
+          </w:tcPr>
+          <w:p>
+            <w:r/>
+            <w:r>
+              <w:rPr>
+                <w:sz w:val="18"/>
+              </w:rPr>
+              <w:t>배너/이벤트 성과 테이블.</w:t>
             </w:r>
           </w:p>
         </w:tc>
@@ -1057,6 +1416,14 @@
         <w:t>2.2. 백엔드 (Backend) 개발 요건</w:t>
       </w:r>
     </w:p>
+    <w:p>
+      <w:pPr>
+        <w:pStyle w:val="Heading3"/>
+      </w:pPr>
+      <w:r>
+        <w:t>DashboardStats (통계 요약)</w:t>
+      </w:r>
+    </w:p>
     <w:tbl>
       <w:tblPr>
         <w:tblStyle w:val="TableGrid"/>
@@ -1065,11 +1432,10 @@
         <w:tblLook w:firstColumn="1" w:firstRow="1" w:lastColumn="0" w:lastRow="0" w:noHBand="0" w:noVBand="1" w:val="04A0"/>
       </w:tblPr>
       <w:tblGrid>
-        <w:gridCol w:w="1728"/>
-        <w:gridCol w:w="1728"/>
-        <w:gridCol w:w="1728"/>
-        <w:gridCol w:w="1728"/>
-        <w:gridCol w:w="1728"/>
+        <w:gridCol w:w="2160"/>
+        <w:gridCol w:w="2160"/>
+        <w:gridCol w:w="2160"/>
+        <w:gridCol w:w="2160"/>
       </w:tblGrid>
       <w:tr>
         <w:tc>
@@ -1088,13 +1454,13 @@
                 <w:color w:val="FFFFFF"/>
                 <w:sz w:val="18"/>
               </w:rPr>
-              <w:t>데이터베이스 필드</w:t>
-            </w:r>
-          </w:p>
-        </w:tc>
-        <w:tc>
-          <w:tcPr>
-            <w:tcW w:type="dxa" w:w="1417"/>
+              <w:t>필드</w:t>
+            </w:r>
+          </w:p>
+        </w:tc>
+        <w:tc>
+          <w:tcPr>
+            <w:tcW w:type="dxa" w:w="1701"/>
             <w:shd w:val="clear" w:color="auto" w:fill="2E4057"/>
           </w:tcPr>
           <w:p>
@@ -1108,7 +1474,7 @@
                 <w:color w:val="FFFFFF"/>
                 <w:sz w:val="18"/>
               </w:rPr>
-              <w:t>데이터 타입</w:t>
+              <w:t>타입</w:t>
             </w:r>
           </w:p>
         </w:tc>
@@ -1128,13 +1494,13 @@
                 <w:color w:val="FFFFFF"/>
                 <w:sz w:val="18"/>
               </w:rPr>
-              <w:t>필수 여부</w:t>
-            </w:r>
-          </w:p>
-        </w:tc>
-        <w:tc>
-          <w:tcPr>
-            <w:tcW w:type="dxa" w:w="1984"/>
+              <w:t>필수</w:t>
+            </w:r>
+          </w:p>
+        </w:tc>
+        <w:tc>
+          <w:tcPr>
+            <w:tcW w:type="dxa" w:w="4819"/>
             <w:shd w:val="clear" w:color="auto" w:fill="2E4057"/>
           </w:tcPr>
           <w:p>
@@ -1148,13 +1514,998 @@
                 <w:color w:val="FFFFFF"/>
                 <w:sz w:val="18"/>
               </w:rPr>
-              <w:t>글자수 / 제약조건</w:t>
-            </w:r>
-          </w:p>
-        </w:tc>
-        <w:tc>
-          <w:tcPr>
-            <w:tcW w:type="dxa" w:w="3118"/>
+              <w:t>비고</w:t>
+            </w:r>
+          </w:p>
+        </w:tc>
+      </w:tr>
+      <w:tr>
+        <w:tc>
+          <w:tcPr>
+            <w:tcW w:type="dxa" w:w="2268"/>
+            <w:shd w:val="clear" w:color="auto" w:fill="F5F7FA"/>
+          </w:tcPr>
+          <w:p>
+            <w:r/>
+            <w:r>
+              <w:rPr>
+                <w:sz w:val="18"/>
+              </w:rPr>
+              <w:t>todayRevenue</w:t>
+            </w:r>
+          </w:p>
+        </w:tc>
+        <w:tc>
+          <w:tcPr>
+            <w:tcW w:type="dxa" w:w="1701"/>
+            <w:shd w:val="clear" w:color="auto" w:fill="F5F7FA"/>
+          </w:tcPr>
+          <w:p>
+            <w:r/>
+            <w:r>
+              <w:rPr>
+                <w:sz w:val="18"/>
+              </w:rPr>
+              <w:t>Decimal</w:t>
+            </w:r>
+          </w:p>
+        </w:tc>
+        <w:tc>
+          <w:tcPr>
+            <w:tcW w:type="dxa" w:w="850"/>
+            <w:shd w:val="clear" w:color="auto" w:fill="F5F7FA"/>
+          </w:tcPr>
+          <w:p>
+            <w:r/>
+            <w:r>
+              <w:rPr>
+                <w:sz w:val="18"/>
+              </w:rPr>
+              <w:t>Y</w:t>
+            </w:r>
+          </w:p>
+        </w:tc>
+        <w:tc>
+          <w:tcPr>
+            <w:tcW w:type="dxa" w:w="4819"/>
+            <w:shd w:val="clear" w:color="auto" w:fill="F5F7FA"/>
+          </w:tcPr>
+          <w:p>
+            <w:r/>
+            <w:r>
+              <w:rPr>
+                <w:sz w:val="18"/>
+              </w:rPr>
+              <w:t>기간 내 총 매출</w:t>
+            </w:r>
+          </w:p>
+        </w:tc>
+      </w:tr>
+      <w:tr>
+        <w:tc>
+          <w:tcPr>
+            <w:tcW w:type="dxa" w:w="2268"/>
+          </w:tcPr>
+          <w:p>
+            <w:r/>
+            <w:r>
+              <w:rPr>
+                <w:sz w:val="18"/>
+              </w:rPr>
+              <w:t>todayCompletedRevenue</w:t>
+            </w:r>
+          </w:p>
+        </w:tc>
+        <w:tc>
+          <w:tcPr>
+            <w:tcW w:type="dxa" w:w="1701"/>
+          </w:tcPr>
+          <w:p>
+            <w:r/>
+            <w:r>
+              <w:rPr>
+                <w:sz w:val="18"/>
+              </w:rPr>
+              <w:t>Decimal</w:t>
+            </w:r>
+          </w:p>
+        </w:tc>
+        <w:tc>
+          <w:tcPr>
+            <w:tcW w:type="dxa" w:w="850"/>
+          </w:tcPr>
+          <w:p>
+            <w:r/>
+            <w:r>
+              <w:rPr>
+                <w:sz w:val="18"/>
+              </w:rPr>
+              <w:t>Y</w:t>
+            </w:r>
+          </w:p>
+        </w:tc>
+        <w:tc>
+          <w:tcPr>
+            <w:tcW w:type="dxa" w:w="4819"/>
+          </w:tcPr>
+          <w:p>
+            <w:r/>
+            <w:r>
+              <w:rPr>
+                <w:sz w:val="18"/>
+              </w:rPr>
+              <w:t>주문 완료 금액</w:t>
+            </w:r>
+          </w:p>
+        </w:tc>
+      </w:tr>
+      <w:tr>
+        <w:tc>
+          <w:tcPr>
+            <w:tcW w:type="dxa" w:w="2268"/>
+            <w:shd w:val="clear" w:color="auto" w:fill="F5F7FA"/>
+          </w:tcPr>
+          <w:p>
+            <w:r/>
+            <w:r>
+              <w:rPr>
+                <w:sz w:val="18"/>
+              </w:rPr>
+              <w:t>todayCancelledRevenue</w:t>
+            </w:r>
+          </w:p>
+        </w:tc>
+        <w:tc>
+          <w:tcPr>
+            <w:tcW w:type="dxa" w:w="1701"/>
+            <w:shd w:val="clear" w:color="auto" w:fill="F5F7FA"/>
+          </w:tcPr>
+          <w:p>
+            <w:r/>
+            <w:r>
+              <w:rPr>
+                <w:sz w:val="18"/>
+              </w:rPr>
+              <w:t>Decimal</w:t>
+            </w:r>
+          </w:p>
+        </w:tc>
+        <w:tc>
+          <w:tcPr>
+            <w:tcW w:type="dxa" w:w="850"/>
+            <w:shd w:val="clear" w:color="auto" w:fill="F5F7FA"/>
+          </w:tcPr>
+          <w:p>
+            <w:r/>
+            <w:r>
+              <w:rPr>
+                <w:sz w:val="18"/>
+              </w:rPr>
+              <w:t>Y</w:t>
+            </w:r>
+          </w:p>
+        </w:tc>
+        <w:tc>
+          <w:tcPr>
+            <w:tcW w:type="dxa" w:w="4819"/>
+            <w:shd w:val="clear" w:color="auto" w:fill="F5F7FA"/>
+          </w:tcPr>
+          <w:p>
+            <w:r/>
+            <w:r>
+              <w:rPr>
+                <w:sz w:val="18"/>
+              </w:rPr>
+              <w:t>주문 취소 금액</w:t>
+            </w:r>
+          </w:p>
+        </w:tc>
+      </w:tr>
+      <w:tr>
+        <w:tc>
+          <w:tcPr>
+            <w:tcW w:type="dxa" w:w="2268"/>
+          </w:tcPr>
+          <w:p>
+            <w:r/>
+            <w:r>
+              <w:rPr>
+                <w:sz w:val="18"/>
+              </w:rPr>
+              <w:t>todayOrders</w:t>
+            </w:r>
+          </w:p>
+        </w:tc>
+        <w:tc>
+          <w:tcPr>
+            <w:tcW w:type="dxa" w:w="1701"/>
+          </w:tcPr>
+          <w:p>
+            <w:r/>
+            <w:r>
+              <w:rPr>
+                <w:sz w:val="18"/>
+              </w:rPr>
+              <w:t>Integer</w:t>
+            </w:r>
+          </w:p>
+        </w:tc>
+        <w:tc>
+          <w:tcPr>
+            <w:tcW w:type="dxa" w:w="850"/>
+          </w:tcPr>
+          <w:p>
+            <w:r/>
+            <w:r>
+              <w:rPr>
+                <w:sz w:val="18"/>
+              </w:rPr>
+              <w:t>Y</w:t>
+            </w:r>
+          </w:p>
+        </w:tc>
+        <w:tc>
+          <w:tcPr>
+            <w:tcW w:type="dxa" w:w="4819"/>
+          </w:tcPr>
+          <w:p>
+            <w:r/>
+            <w:r>
+              <w:rPr>
+                <w:sz w:val="18"/>
+              </w:rPr>
+              <w:t>기간 내 총 주문 수</w:t>
+            </w:r>
+          </w:p>
+        </w:tc>
+      </w:tr>
+      <w:tr>
+        <w:tc>
+          <w:tcPr>
+            <w:tcW w:type="dxa" w:w="2268"/>
+            <w:shd w:val="clear" w:color="auto" w:fill="F5F7FA"/>
+          </w:tcPr>
+          <w:p>
+            <w:r/>
+            <w:r>
+              <w:rPr>
+                <w:sz w:val="18"/>
+              </w:rPr>
+              <w:t>totalProducts</w:t>
+            </w:r>
+          </w:p>
+        </w:tc>
+        <w:tc>
+          <w:tcPr>
+            <w:tcW w:type="dxa" w:w="1701"/>
+            <w:shd w:val="clear" w:color="auto" w:fill="F5F7FA"/>
+          </w:tcPr>
+          <w:p>
+            <w:r/>
+            <w:r>
+              <w:rPr>
+                <w:sz w:val="18"/>
+              </w:rPr>
+              <w:t>Integer</w:t>
+            </w:r>
+          </w:p>
+        </w:tc>
+        <w:tc>
+          <w:tcPr>
+            <w:tcW w:type="dxa" w:w="850"/>
+            <w:shd w:val="clear" w:color="auto" w:fill="F5F7FA"/>
+          </w:tcPr>
+          <w:p>
+            <w:r/>
+            <w:r>
+              <w:rPr>
+                <w:sz w:val="18"/>
+              </w:rPr>
+              <w:t>Y</w:t>
+            </w:r>
+          </w:p>
+        </w:tc>
+        <w:tc>
+          <w:tcPr>
+            <w:tcW w:type="dxa" w:w="4819"/>
+            <w:shd w:val="clear" w:color="auto" w:fill="F5F7FA"/>
+          </w:tcPr>
+          <w:p>
+            <w:r/>
+            <w:r>
+              <w:rPr>
+                <w:sz w:val="18"/>
+              </w:rPr>
+              <w:t>등록 상품 수</w:t>
+            </w:r>
+          </w:p>
+        </w:tc>
+      </w:tr>
+      <w:tr>
+        <w:tc>
+          <w:tcPr>
+            <w:tcW w:type="dxa" w:w="2268"/>
+          </w:tcPr>
+          <w:p>
+            <w:r/>
+            <w:r>
+              <w:rPr>
+                <w:sz w:val="18"/>
+              </w:rPr>
+              <w:t>totalStores</w:t>
+            </w:r>
+          </w:p>
+        </w:tc>
+        <w:tc>
+          <w:tcPr>
+            <w:tcW w:type="dxa" w:w="1701"/>
+          </w:tcPr>
+          <w:p>
+            <w:r/>
+            <w:r>
+              <w:rPr>
+                <w:sz w:val="18"/>
+              </w:rPr>
+              <w:t>Integer</w:t>
+            </w:r>
+          </w:p>
+        </w:tc>
+        <w:tc>
+          <w:tcPr>
+            <w:tcW w:type="dxa" w:w="850"/>
+          </w:tcPr>
+          <w:p>
+            <w:r/>
+            <w:r>
+              <w:rPr>
+                <w:sz w:val="18"/>
+              </w:rPr>
+              <w:t>Y</w:t>
+            </w:r>
+          </w:p>
+        </w:tc>
+        <w:tc>
+          <w:tcPr>
+            <w:tcW w:type="dxa" w:w="4819"/>
+          </w:tcPr>
+          <w:p>
+            <w:r/>
+            <w:r>
+              <w:rPr>
+                <w:sz w:val="18"/>
+              </w:rPr>
+              <w:t>등록 가맹점 수</w:t>
+            </w:r>
+          </w:p>
+        </w:tc>
+      </w:tr>
+      <w:tr>
+        <w:tc>
+          <w:tcPr>
+            <w:tcW w:type="dxa" w:w="2268"/>
+            <w:shd w:val="clear" w:color="auto" w:fill="F5F7FA"/>
+          </w:tcPr>
+          <w:p>
+            <w:r/>
+            <w:r>
+              <w:rPr>
+                <w:sz w:val="18"/>
+              </w:rPr>
+              <w:t>yesterdayOrders</w:t>
+            </w:r>
+          </w:p>
+        </w:tc>
+        <w:tc>
+          <w:tcPr>
+            <w:tcW w:type="dxa" w:w="1701"/>
+            <w:shd w:val="clear" w:color="auto" w:fill="F5F7FA"/>
+          </w:tcPr>
+          <w:p>
+            <w:r/>
+            <w:r>
+              <w:rPr>
+                <w:sz w:val="18"/>
+              </w:rPr>
+              <w:t>Integer</w:t>
+            </w:r>
+          </w:p>
+        </w:tc>
+        <w:tc>
+          <w:tcPr>
+            <w:tcW w:type="dxa" w:w="850"/>
+            <w:shd w:val="clear" w:color="auto" w:fill="F5F7FA"/>
+          </w:tcPr>
+          <w:p>
+            <w:r/>
+            <w:r>
+              <w:rPr>
+                <w:sz w:val="18"/>
+              </w:rPr>
+              <w:t>Y</w:t>
+            </w:r>
+          </w:p>
+        </w:tc>
+        <w:tc>
+          <w:tcPr>
+            <w:tcW w:type="dxa" w:w="4819"/>
+            <w:shd w:val="clear" w:color="auto" w:fill="F5F7FA"/>
+          </w:tcPr>
+          <w:p>
+            <w:r/>
+            <w:r>
+              <w:rPr>
+                <w:sz w:val="18"/>
+              </w:rPr>
+              <w:t>전일 주문 수</w:t>
+            </w:r>
+          </w:p>
+        </w:tc>
+      </w:tr>
+      <w:tr>
+        <w:tc>
+          <w:tcPr>
+            <w:tcW w:type="dxa" w:w="2268"/>
+          </w:tcPr>
+          <w:p>
+            <w:r/>
+            <w:r>
+              <w:rPr>
+                <w:sz w:val="18"/>
+              </w:rPr>
+              <w:t>yesterdayRevenue</w:t>
+            </w:r>
+          </w:p>
+        </w:tc>
+        <w:tc>
+          <w:tcPr>
+            <w:tcW w:type="dxa" w:w="1701"/>
+          </w:tcPr>
+          <w:p>
+            <w:r/>
+            <w:r>
+              <w:rPr>
+                <w:sz w:val="18"/>
+              </w:rPr>
+              <w:t>Decimal</w:t>
+            </w:r>
+          </w:p>
+        </w:tc>
+        <w:tc>
+          <w:tcPr>
+            <w:tcW w:type="dxa" w:w="850"/>
+          </w:tcPr>
+          <w:p>
+            <w:r/>
+            <w:r>
+              <w:rPr>
+                <w:sz w:val="18"/>
+              </w:rPr>
+              <w:t>Y</w:t>
+            </w:r>
+          </w:p>
+        </w:tc>
+        <w:tc>
+          <w:tcPr>
+            <w:tcW w:type="dxa" w:w="4819"/>
+          </w:tcPr>
+          <w:p>
+            <w:r/>
+            <w:r>
+              <w:rPr>
+                <w:sz w:val="18"/>
+              </w:rPr>
+              <w:t>전일 매출</w:t>
+            </w:r>
+          </w:p>
+        </w:tc>
+      </w:tr>
+      <w:tr>
+        <w:tc>
+          <w:tcPr>
+            <w:tcW w:type="dxa" w:w="2268"/>
+            <w:shd w:val="clear" w:color="auto" w:fill="F5F7FA"/>
+          </w:tcPr>
+          <w:p>
+            <w:r/>
+            <w:r>
+              <w:rPr>
+                <w:sz w:val="18"/>
+              </w:rPr>
+              <w:t>ordersChange</w:t>
+            </w:r>
+          </w:p>
+        </w:tc>
+        <w:tc>
+          <w:tcPr>
+            <w:tcW w:type="dxa" w:w="1701"/>
+            <w:shd w:val="clear" w:color="auto" w:fill="F5F7FA"/>
+          </w:tcPr>
+          <w:p>
+            <w:r/>
+            <w:r>
+              <w:rPr>
+                <w:sz w:val="18"/>
+              </w:rPr>
+              <w:t>Float</w:t>
+            </w:r>
+          </w:p>
+        </w:tc>
+        <w:tc>
+          <w:tcPr>
+            <w:tcW w:type="dxa" w:w="850"/>
+            <w:shd w:val="clear" w:color="auto" w:fill="F5F7FA"/>
+          </w:tcPr>
+          <w:p>
+            <w:r/>
+            <w:r>
+              <w:rPr>
+                <w:sz w:val="18"/>
+              </w:rPr>
+              <w:t>Y</w:t>
+            </w:r>
+          </w:p>
+        </w:tc>
+        <w:tc>
+          <w:tcPr>
+            <w:tcW w:type="dxa" w:w="4819"/>
+            <w:shd w:val="clear" w:color="auto" w:fill="F5F7FA"/>
+          </w:tcPr>
+          <w:p>
+            <w:r/>
+            <w:r>
+              <w:rPr>
+                <w:sz w:val="18"/>
+              </w:rPr>
+              <w:t>주문 수 변화율(%)</w:t>
+            </w:r>
+          </w:p>
+        </w:tc>
+      </w:tr>
+      <w:tr>
+        <w:tc>
+          <w:tcPr>
+            <w:tcW w:type="dxa" w:w="2268"/>
+          </w:tcPr>
+          <w:p>
+            <w:r/>
+            <w:r>
+              <w:rPr>
+                <w:sz w:val="18"/>
+              </w:rPr>
+              <w:t>revenueChange</w:t>
+            </w:r>
+          </w:p>
+        </w:tc>
+        <w:tc>
+          <w:tcPr>
+            <w:tcW w:type="dxa" w:w="1701"/>
+          </w:tcPr>
+          <w:p>
+            <w:r/>
+            <w:r>
+              <w:rPr>
+                <w:sz w:val="18"/>
+              </w:rPr>
+              <w:t>Float</w:t>
+            </w:r>
+          </w:p>
+        </w:tc>
+        <w:tc>
+          <w:tcPr>
+            <w:tcW w:type="dxa" w:w="850"/>
+          </w:tcPr>
+          <w:p>
+            <w:r/>
+            <w:r>
+              <w:rPr>
+                <w:sz w:val="18"/>
+              </w:rPr>
+              <w:t>Y</w:t>
+            </w:r>
+          </w:p>
+        </w:tc>
+        <w:tc>
+          <w:tcPr>
+            <w:tcW w:type="dxa" w:w="4819"/>
+          </w:tcPr>
+          <w:p>
+            <w:r/>
+            <w:r>
+              <w:rPr>
+                <w:sz w:val="18"/>
+              </w:rPr>
+              <w:t>매출 변화율(%)</w:t>
+            </w:r>
+          </w:p>
+        </w:tc>
+      </w:tr>
+      <w:tr>
+        <w:tc>
+          <w:tcPr>
+            <w:tcW w:type="dxa" w:w="2268"/>
+            <w:shd w:val="clear" w:color="auto" w:fill="F5F7FA"/>
+          </w:tcPr>
+          <w:p>
+            <w:r/>
+            <w:r>
+              <w:rPr>
+                <w:sz w:val="18"/>
+              </w:rPr>
+              <w:t>totalMembers</w:t>
+            </w:r>
+          </w:p>
+        </w:tc>
+        <w:tc>
+          <w:tcPr>
+            <w:tcW w:type="dxa" w:w="1701"/>
+            <w:shd w:val="clear" w:color="auto" w:fill="F5F7FA"/>
+          </w:tcPr>
+          <w:p>
+            <w:r/>
+            <w:r>
+              <w:rPr>
+                <w:sz w:val="18"/>
+              </w:rPr>
+              <w:t>Integer</w:t>
+            </w:r>
+          </w:p>
+        </w:tc>
+        <w:tc>
+          <w:tcPr>
+            <w:tcW w:type="dxa" w:w="850"/>
+            <w:shd w:val="clear" w:color="auto" w:fill="F5F7FA"/>
+          </w:tcPr>
+          <w:p>
+            <w:r/>
+            <w:r>
+              <w:rPr>
+                <w:sz w:val="18"/>
+              </w:rPr>
+              <w:t>Y</w:t>
+            </w:r>
+          </w:p>
+        </w:tc>
+        <w:tc>
+          <w:tcPr>
+            <w:tcW w:type="dxa" w:w="4819"/>
+            <w:shd w:val="clear" w:color="auto" w:fill="F5F7FA"/>
+          </w:tcPr>
+          <w:p>
+            <w:r/>
+            <w:r>
+              <w:rPr>
+                <w:sz w:val="18"/>
+              </w:rPr>
+              <w:t>전체 회원 수</w:t>
+            </w:r>
+          </w:p>
+        </w:tc>
+      </w:tr>
+      <w:tr>
+        <w:tc>
+          <w:tcPr>
+            <w:tcW w:type="dxa" w:w="2268"/>
+          </w:tcPr>
+          <w:p>
+            <w:r/>
+            <w:r>
+              <w:rPr>
+                <w:sz w:val="18"/>
+              </w:rPr>
+              <w:t>newSignupNormal</w:t>
+            </w:r>
+          </w:p>
+        </w:tc>
+        <w:tc>
+          <w:tcPr>
+            <w:tcW w:type="dxa" w:w="1701"/>
+          </w:tcPr>
+          <w:p>
+            <w:r/>
+            <w:r>
+              <w:rPr>
+                <w:sz w:val="18"/>
+              </w:rPr>
+              <w:t>Integer</w:t>
+            </w:r>
+          </w:p>
+        </w:tc>
+        <w:tc>
+          <w:tcPr>
+            <w:tcW w:type="dxa" w:w="850"/>
+          </w:tcPr>
+          <w:p>
+            <w:r/>
+            <w:r>
+              <w:rPr>
+                <w:sz w:val="18"/>
+              </w:rPr>
+              <w:t>Y</w:t>
+            </w:r>
+          </w:p>
+        </w:tc>
+        <w:tc>
+          <w:tcPr>
+            <w:tcW w:type="dxa" w:w="4819"/>
+          </w:tcPr>
+          <w:p>
+            <w:r/>
+            <w:r>
+              <w:rPr>
+                <w:sz w:val="18"/>
+              </w:rPr>
+              <w:t>신규 일반 회원가입 수</w:t>
+            </w:r>
+          </w:p>
+        </w:tc>
+      </w:tr>
+      <w:tr>
+        <w:tc>
+          <w:tcPr>
+            <w:tcW w:type="dxa" w:w="2268"/>
+            <w:shd w:val="clear" w:color="auto" w:fill="F5F7FA"/>
+          </w:tcPr>
+          <w:p>
+            <w:r/>
+            <w:r>
+              <w:rPr>
+                <w:sz w:val="18"/>
+              </w:rPr>
+              <w:t>newSignupSimple</w:t>
+            </w:r>
+          </w:p>
+        </w:tc>
+        <w:tc>
+          <w:tcPr>
+            <w:tcW w:type="dxa" w:w="1701"/>
+            <w:shd w:val="clear" w:color="auto" w:fill="F5F7FA"/>
+          </w:tcPr>
+          <w:p>
+            <w:r/>
+            <w:r>
+              <w:rPr>
+                <w:sz w:val="18"/>
+              </w:rPr>
+              <w:t>Integer</w:t>
+            </w:r>
+          </w:p>
+        </w:tc>
+        <w:tc>
+          <w:tcPr>
+            <w:tcW w:type="dxa" w:w="850"/>
+            <w:shd w:val="clear" w:color="auto" w:fill="F5F7FA"/>
+          </w:tcPr>
+          <w:p>
+            <w:r/>
+            <w:r>
+              <w:rPr>
+                <w:sz w:val="18"/>
+              </w:rPr>
+              <w:t>Y</w:t>
+            </w:r>
+          </w:p>
+        </w:tc>
+        <w:tc>
+          <w:tcPr>
+            <w:tcW w:type="dxa" w:w="4819"/>
+            <w:shd w:val="clear" w:color="auto" w:fill="F5F7FA"/>
+          </w:tcPr>
+          <w:p>
+            <w:r/>
+            <w:r>
+              <w:rPr>
+                <w:sz w:val="18"/>
+              </w:rPr>
+              <w:t>신규 간편 회원가입 수</w:t>
+            </w:r>
+          </w:p>
+        </w:tc>
+      </w:tr>
+      <w:tr>
+        <w:tc>
+          <w:tcPr>
+            <w:tcW w:type="dxa" w:w="2268"/>
+          </w:tcPr>
+          <w:p>
+            <w:r/>
+            <w:r>
+              <w:rPr>
+                <w:sz w:val="18"/>
+              </w:rPr>
+              <w:t>withdrawalCount</w:t>
+            </w:r>
+          </w:p>
+        </w:tc>
+        <w:tc>
+          <w:tcPr>
+            <w:tcW w:type="dxa" w:w="1701"/>
+          </w:tcPr>
+          <w:p>
+            <w:r/>
+            <w:r>
+              <w:rPr>
+                <w:sz w:val="18"/>
+              </w:rPr>
+              <w:t>Integer</w:t>
+            </w:r>
+          </w:p>
+        </w:tc>
+        <w:tc>
+          <w:tcPr>
+            <w:tcW w:type="dxa" w:w="850"/>
+          </w:tcPr>
+          <w:p>
+            <w:r/>
+            <w:r>
+              <w:rPr>
+                <w:sz w:val="18"/>
+              </w:rPr>
+              <w:t>Y</w:t>
+            </w:r>
+          </w:p>
+        </w:tc>
+        <w:tc>
+          <w:tcPr>
+            <w:tcW w:type="dxa" w:w="4819"/>
+          </w:tcPr>
+          <w:p>
+            <w:r/>
+            <w:r>
+              <w:rPr>
+                <w:sz w:val="18"/>
+              </w:rPr>
+              <w:t>탈퇴 회원 수</w:t>
+            </w:r>
+          </w:p>
+        </w:tc>
+      </w:tr>
+      <w:tr>
+        <w:tc>
+          <w:tcPr>
+            <w:tcW w:type="dxa" w:w="2268"/>
+            <w:shd w:val="clear" w:color="auto" w:fill="F5F7FA"/>
+          </w:tcPr>
+          <w:p>
+            <w:r/>
+            <w:r>
+              <w:rPr>
+                <w:sz w:val="18"/>
+              </w:rPr>
+              <w:t>pendingInquiries</w:t>
+            </w:r>
+          </w:p>
+        </w:tc>
+        <w:tc>
+          <w:tcPr>
+            <w:tcW w:type="dxa" w:w="1701"/>
+            <w:shd w:val="clear" w:color="auto" w:fill="F5F7FA"/>
+          </w:tcPr>
+          <w:p>
+            <w:r/>
+            <w:r>
+              <w:rPr>
+                <w:sz w:val="18"/>
+              </w:rPr>
+              <w:t>Integer</w:t>
+            </w:r>
+          </w:p>
+        </w:tc>
+        <w:tc>
+          <w:tcPr>
+            <w:tcW w:type="dxa" w:w="850"/>
+            <w:shd w:val="clear" w:color="auto" w:fill="F5F7FA"/>
+          </w:tcPr>
+          <w:p>
+            <w:r/>
+            <w:r>
+              <w:rPr>
+                <w:sz w:val="18"/>
+              </w:rPr>
+              <w:t>Y</w:t>
+            </w:r>
+          </w:p>
+        </w:tc>
+        <w:tc>
+          <w:tcPr>
+            <w:tcW w:type="dxa" w:w="4819"/>
+            <w:shd w:val="clear" w:color="auto" w:fill="F5F7FA"/>
+          </w:tcPr>
+          <w:p>
+            <w:r/>
+            <w:r>
+              <w:rPr>
+                <w:sz w:val="18"/>
+              </w:rPr>
+              <w:t>대기 중 문의 (InquiryStatus: pending)</w:t>
+            </w:r>
+          </w:p>
+        </w:tc>
+      </w:tr>
+      <w:tr>
+        <w:tc>
+          <w:tcPr>
+            <w:tcW w:type="dxa" w:w="2268"/>
+          </w:tcPr>
+          <w:p>
+            <w:r/>
+            <w:r>
+              <w:rPr>
+                <w:sz w:val="18"/>
+              </w:rPr>
+              <w:t>resolvedInquiries</w:t>
+            </w:r>
+          </w:p>
+        </w:tc>
+        <w:tc>
+          <w:tcPr>
+            <w:tcW w:type="dxa" w:w="1701"/>
+          </w:tcPr>
+          <w:p>
+            <w:r/>
+            <w:r>
+              <w:rPr>
+                <w:sz w:val="18"/>
+              </w:rPr>
+              <w:t>Integer</w:t>
+            </w:r>
+          </w:p>
+        </w:tc>
+        <w:tc>
+          <w:tcPr>
+            <w:tcW w:type="dxa" w:w="850"/>
+          </w:tcPr>
+          <w:p>
+            <w:r/>
+            <w:r>
+              <w:rPr>
+                <w:sz w:val="18"/>
+              </w:rPr>
+              <w:t>Y</w:t>
+            </w:r>
+          </w:p>
+        </w:tc>
+        <w:tc>
+          <w:tcPr>
+            <w:tcW w:type="dxa" w:w="4819"/>
+          </w:tcPr>
+          <w:p>
+            <w:r/>
+            <w:r>
+              <w:rPr>
+                <w:sz w:val="18"/>
+              </w:rPr>
+              <w:t>처리 완료 (InquiryStatus: resolved)</w:t>
+            </w:r>
+          </w:p>
+        </w:tc>
+      </w:tr>
+    </w:tbl>
+    <w:p/>
+    <w:p>
+      <w:pPr>
+        <w:pStyle w:val="Heading3"/>
+      </w:pPr>
+      <w:r>
+        <w:t>개별 API 응답 데이터</w:t>
+      </w:r>
+    </w:p>
+    <w:tbl>
+      <w:tblPr>
+        <w:tblStyle w:val="TableGrid"/>
+        <w:tblW w:type="auto" w:w="0"/>
+        <w:jc w:val="center"/>
+        <w:tblLook w:firstColumn="1" w:firstRow="1" w:lastColumn="0" w:lastRow="0" w:noHBand="0" w:noVBand="1" w:val="04A0"/>
+      </w:tblPr>
+      <w:tblGrid>
+        <w:gridCol w:w="2160"/>
+        <w:gridCol w:w="2160"/>
+        <w:gridCol w:w="2160"/>
+        <w:gridCol w:w="2160"/>
+      </w:tblGrid>
+      <w:tr>
+        <w:tc>
+          <w:tcPr>
+            <w:tcW w:type="dxa" w:w="2268"/>
             <w:shd w:val="clear" w:color="auto" w:fill="2E4057"/>
           </w:tcPr>
           <w:p>
@@ -1168,7 +2519,67 @@
                 <w:color w:val="FFFFFF"/>
                 <w:sz w:val="18"/>
               </w:rPr>
-              <w:t>비고 (API 설계)</w:t>
+              <w:t>필드</w:t>
+            </w:r>
+          </w:p>
+        </w:tc>
+        <w:tc>
+          <w:tcPr>
+            <w:tcW w:type="dxa" w:w="1701"/>
+            <w:shd w:val="clear" w:color="auto" w:fill="2E4057"/>
+          </w:tcPr>
+          <w:p>
+            <w:pPr>
+              <w:jc w:val="center"/>
+            </w:pPr>
+            <w:r/>
+            <w:r>
+              <w:rPr>
+                <w:b/>
+                <w:color w:val="FFFFFF"/>
+                <w:sz w:val="18"/>
+              </w:rPr>
+              <w:t>타입</w:t>
+            </w:r>
+          </w:p>
+        </w:tc>
+        <w:tc>
+          <w:tcPr>
+            <w:tcW w:type="dxa" w:w="850"/>
+            <w:shd w:val="clear" w:color="auto" w:fill="2E4057"/>
+          </w:tcPr>
+          <w:p>
+            <w:pPr>
+              <w:jc w:val="center"/>
+            </w:pPr>
+            <w:r/>
+            <w:r>
+              <w:rPr>
+                <w:b/>
+                <w:color w:val="FFFFFF"/>
+                <w:sz w:val="18"/>
+              </w:rPr>
+              <w:t>API</w:t>
+            </w:r>
+          </w:p>
+        </w:tc>
+        <w:tc>
+          <w:tcPr>
+            <w:tcW w:type="dxa" w:w="4819"/>
+            <w:shd w:val="clear" w:color="auto" w:fill="2E4057"/>
+          </w:tcPr>
+          <w:p>
+            <w:pPr>
+              <w:jc w:val="center"/>
+            </w:pPr>
+            <w:r/>
+            <w:r>
+              <w:rPr>
+                <w:b/>
+                <w:color w:val="FFFFFF"/>
+                <w:sz w:val="18"/>
+              </w:rPr>
+              <w:t>비고</w:t>
             </w:r>
           </w:p>
         </w:tc>
@@ -1185,13 +2596,13 @@
               <w:rPr>
                 <w:sz w:val="18"/>
               </w:rPr>
-              <w:t>dateRange</w:t>
-            </w:r>
-          </w:p>
-        </w:tc>
-        <w:tc>
-          <w:tcPr>
-            <w:tcW w:type="dxa" w:w="1417"/>
+              <w:t>dailySales</w:t>
+            </w:r>
+          </w:p>
+        </w:tc>
+        <w:tc>
+          <w:tcPr>
+            <w:tcW w:type="dxa" w:w="1701"/>
             <w:shd w:val="clear" w:color="auto" w:fill="F5F7FA"/>
           </w:tcPr>
           <w:p>
@@ -1200,7 +2611,7 @@
               <w:rPr>
                 <w:sz w:val="18"/>
               </w:rPr>
-              <w:t>JSON</w:t>
+              <w:t>DailySalesItem[]</w:t>
             </w:r>
           </w:p>
         </w:tc>
@@ -1215,13 +2626,13 @@
               <w:rPr>
                 <w:sz w:val="18"/>
               </w:rPr>
-              <w:t>Y</w:t>
-            </w:r>
-          </w:p>
-        </w:tc>
-        <w:tc>
-          <w:tcPr>
-            <w:tcW w:type="dxa" w:w="1984"/>
+              <w:t>`GET /dashboard/daily-sales`</w:t>
+            </w:r>
+          </w:p>
+        </w:tc>
+        <w:tc>
+          <w:tcPr>
+            <w:tcW w:type="dxa" w:w="4819"/>
             <w:shd w:val="clear" w:color="auto" w:fill="F5F7FA"/>
           </w:tcPr>
           <w:p>
@@ -1230,22 +2641,7 @@
               <w:rPr>
                 <w:sz w:val="18"/>
               </w:rPr>
-              <w:t>{ from, to }</w:t>
-            </w:r>
-          </w:p>
-        </w:tc>
-        <w:tc>
-          <w:tcPr>
-            <w:tcW w:type="dxa" w:w="3118"/>
-            <w:shd w:val="clear" w:color="auto" w:fill="F5F7FA"/>
-          </w:tcPr>
-          <w:p>
-            <w:r/>
-            <w:r>
-              <w:rPr>
-                <w:sz w:val="18"/>
-              </w:rPr>
-              <w:t>조회 기간 파라미터다.</w:t>
+              <w:t>일별 매출/주문수/평균주문금액</w:t>
             </w:r>
           </w:p>
         </w:tc>
@@ -1261,21 +2657,21 @@
               <w:rPr>
                 <w:sz w:val="18"/>
               </w:rPr>
-              <w:t>todayRevenue</w:t>
-            </w:r>
-          </w:p>
-        </w:tc>
-        <w:tc>
-          <w:tcPr>
-            <w:tcW w:type="dxa" w:w="1417"/>
-          </w:tcPr>
-          <w:p>
-            <w:r/>
-            <w:r>
-              <w:rPr>
-                <w:sz w:val="18"/>
-              </w:rPr>
-              <w:t>Decimal</w:t>
+              <w:t>orderDetails</w:t>
+            </w:r>
+          </w:p>
+        </w:tc>
+        <w:tc>
+          <w:tcPr>
+            <w:tcW w:type="dxa" w:w="1701"/>
+          </w:tcPr>
+          <w:p>
+            <w:r/>
+            <w:r>
+              <w:rPr>
+                <w:sz w:val="18"/>
+              </w:rPr>
+              <w:t>OrderDetailsData</w:t>
             </w:r>
           </w:p>
         </w:tc>
@@ -1289,35 +2685,21 @@
               <w:rPr>
                 <w:sz w:val="18"/>
               </w:rPr>
-              <w:t>Y</w:t>
-            </w:r>
-          </w:p>
-        </w:tc>
-        <w:tc>
-          <w:tcPr>
-            <w:tcW w:type="dxa" w:w="1984"/>
-          </w:tcPr>
-          <w:p>
-            <w:r/>
-            <w:r>
-              <w:rPr>
-                <w:sz w:val="18"/>
-              </w:rPr>
-              <w:t>-</w:t>
-            </w:r>
-          </w:p>
-        </w:tc>
-        <w:tc>
-          <w:tcPr>
-            <w:tcW w:type="dxa" w:w="3118"/>
-          </w:tcPr>
-          <w:p>
-            <w:r/>
-            <w:r>
-              <w:rPr>
-                <w:sz w:val="18"/>
-              </w:rPr>
-              <w:t>기간 내 총 매출이다.</w:t>
+              <w:t>`GET /dashboard/order-details`</w:t>
+            </w:r>
+          </w:p>
+        </w:tc>
+        <w:tc>
+          <w:tcPr>
+            <w:tcW w:type="dxa" w:w="4819"/>
+          </w:tcPr>
+          <w:p>
+            <w:r/>
+            <w:r>
+              <w:rPr>
+                <w:sz w:val="18"/>
+              </w:rPr>
+              <w:t>유형별/채널별/결제수단별/회원별 비율+건수</w:t>
             </w:r>
           </w:p>
         </w:tc>
@@ -1334,13 +2716,13 @@
               <w:rPr>
                 <w:sz w:val="18"/>
               </w:rPr>
-              <w:t>todayOrders</w:t>
-            </w:r>
-          </w:p>
-        </w:tc>
-        <w:tc>
-          <w:tcPr>
-            <w:tcW w:type="dxa" w:w="1417"/>
+              <w:t>memberAnalytics</w:t>
+            </w:r>
+          </w:p>
+        </w:tc>
+        <w:tc>
+          <w:tcPr>
+            <w:tcW w:type="dxa" w:w="1701"/>
             <w:shd w:val="clear" w:color="auto" w:fill="F5F7FA"/>
           </w:tcPr>
           <w:p>
@@ -1349,7 +2731,7 @@
               <w:rPr>
                 <w:sz w:val="18"/>
               </w:rPr>
-              <w:t>Integer</w:t>
+              <w:t>MemberAnalyticsData</w:t>
             </w:r>
           </w:p>
         </w:tc>
@@ -1364,13 +2746,13 @@
               <w:rPr>
                 <w:sz w:val="18"/>
               </w:rPr>
-              <w:t>Y</w:t>
-            </w:r>
-          </w:p>
-        </w:tc>
-        <w:tc>
-          <w:tcPr>
-            <w:tcW w:type="dxa" w:w="1984"/>
+              <w:t>`GET /dashboard/member-analytics`</w:t>
+            </w:r>
+          </w:p>
+        </w:tc>
+        <w:tc>
+          <w:tcPr>
+            <w:tcW w:type="dxa" w:w="4819"/>
             <w:shd w:val="clear" w:color="auto" w:fill="F5F7FA"/>
           </w:tcPr>
           <w:p>
@@ -1379,22 +2761,7 @@
               <w:rPr>
                 <w:sz w:val="18"/>
               </w:rPr>
-              <w:t>-</w:t>
-            </w:r>
-          </w:p>
-        </w:tc>
-        <w:tc>
-          <w:tcPr>
-            <w:tcW w:type="dxa" w:w="3118"/>
-            <w:shd w:val="clear" w:color="auto" w:fill="F5F7FA"/>
-          </w:tcPr>
-          <w:p>
-            <w:r/>
-            <w:r>
-              <w:rPr>
-                <w:sz w:val="18"/>
-              </w:rPr>
-              <w:t>기간 내 총 주문 수다.</w:t>
+              <w:t>요약/성별/연령/등급/성장/Top5/주문빈도</w:t>
             </w:r>
           </w:p>
         </w:tc>
@@ -1410,21 +2777,21 @@
               <w:rPr>
                 <w:sz w:val="18"/>
               </w:rPr>
-              <w:t>newMembers</w:t>
-            </w:r>
-          </w:p>
-        </w:tc>
-        <w:tc>
-          <w:tcPr>
-            <w:tcW w:type="dxa" w:w="1417"/>
-          </w:tcPr>
-          <w:p>
-            <w:r/>
-            <w:r>
-              <w:rPr>
-                <w:sz w:val="18"/>
-              </w:rPr>
-              <w:t>Integer</w:t>
+              <w:t>marketingPerformance</w:t>
+            </w:r>
+          </w:p>
+        </w:tc>
+        <w:tc>
+          <w:tcPr>
+            <w:tcW w:type="dxa" w:w="1701"/>
+          </w:tcPr>
+          <w:p>
+            <w:r/>
+            <w:r>
+              <w:rPr>
+                <w:sz w:val="18"/>
+              </w:rPr>
+              <w:t>MarketingStats</w:t>
             </w:r>
           </w:p>
         </w:tc>
@@ -1438,333 +2805,21 @@
               <w:rPr>
                 <w:sz w:val="18"/>
               </w:rPr>
-              <w:t>Y</w:t>
-            </w:r>
-          </w:p>
-        </w:tc>
-        <w:tc>
-          <w:tcPr>
-            <w:tcW w:type="dxa" w:w="1984"/>
-          </w:tcPr>
-          <w:p>
-            <w:r/>
-            <w:r>
-              <w:rPr>
-                <w:sz w:val="18"/>
-              </w:rPr>
-              <w:t>-</w:t>
-            </w:r>
-          </w:p>
-        </w:tc>
-        <w:tc>
-          <w:tcPr>
-            <w:tcW w:type="dxa" w:w="3118"/>
-          </w:tcPr>
-          <w:p>
-            <w:r/>
-            <w:r>
-              <w:rPr>
-                <w:sz w:val="18"/>
-              </w:rPr>
-              <w:t>기간 내 신규 회원 수다.</w:t>
-            </w:r>
-          </w:p>
-        </w:tc>
-      </w:tr>
-      <w:tr>
-        <w:tc>
-          <w:tcPr>
-            <w:tcW w:type="dxa" w:w="2268"/>
-            <w:shd w:val="clear" w:color="auto" w:fill="F5F7FA"/>
-          </w:tcPr>
-          <w:p>
-            <w:r/>
-            <w:r>
-              <w:rPr>
-                <w:sz w:val="18"/>
-              </w:rPr>
-              <w:t>dailySales</w:t>
-            </w:r>
-          </w:p>
-        </w:tc>
-        <w:tc>
-          <w:tcPr>
-            <w:tcW w:type="dxa" w:w="1417"/>
-            <w:shd w:val="clear" w:color="auto" w:fill="F5F7FA"/>
-          </w:tcPr>
-          <w:p>
-            <w:r/>
-            <w:r>
-              <w:rPr>
-                <w:sz w:val="18"/>
-              </w:rPr>
-              <w:t>JSON[]</w:t>
-            </w:r>
-          </w:p>
-        </w:tc>
-        <w:tc>
-          <w:tcPr>
-            <w:tcW w:type="dxa" w:w="850"/>
-            <w:shd w:val="clear" w:color="auto" w:fill="F5F7FA"/>
-          </w:tcPr>
-          <w:p>
-            <w:r/>
-            <w:r>
-              <w:rPr>
-                <w:sz w:val="18"/>
-              </w:rPr>
-              <w:t>Y</w:t>
-            </w:r>
-          </w:p>
-        </w:tc>
-        <w:tc>
-          <w:tcPr>
-            <w:tcW w:type="dxa" w:w="1984"/>
-            <w:shd w:val="clear" w:color="auto" w:fill="F5F7FA"/>
-          </w:tcPr>
-          <w:p>
-            <w:r/>
-            <w:r>
-              <w:rPr>
-                <w:sz w:val="18"/>
-              </w:rPr>
-              <w:t>-</w:t>
-            </w:r>
-          </w:p>
-        </w:tc>
-        <w:tc>
-          <w:tcPr>
-            <w:tcW w:type="dxa" w:w="3118"/>
-            <w:shd w:val="clear" w:color="auto" w:fill="F5F7FA"/>
-          </w:tcPr>
-          <w:p>
-            <w:r/>
-            <w:r>
-              <w:rPr>
-                <w:sz w:val="18"/>
-              </w:rPr>
-              <w:t>일별 매출 차트 데이터다.</w:t>
-            </w:r>
-          </w:p>
-        </w:tc>
-      </w:tr>
-      <w:tr>
-        <w:tc>
-          <w:tcPr>
-            <w:tcW w:type="dxa" w:w="2268"/>
-          </w:tcPr>
-          <w:p>
-            <w:r/>
-            <w:r>
-              <w:rPr>
-                <w:sz w:val="18"/>
-              </w:rPr>
-              <w:t>orderDetails</w:t>
-            </w:r>
-          </w:p>
-        </w:tc>
-        <w:tc>
-          <w:tcPr>
-            <w:tcW w:type="dxa" w:w="1417"/>
-          </w:tcPr>
-          <w:p>
-            <w:r/>
-            <w:r>
-              <w:rPr>
-                <w:sz w:val="18"/>
-              </w:rPr>
-              <w:t>JSON</w:t>
-            </w:r>
-          </w:p>
-        </w:tc>
-        <w:tc>
-          <w:tcPr>
-            <w:tcW w:type="dxa" w:w="850"/>
-          </w:tcPr>
-          <w:p>
-            <w:r/>
-            <w:r>
-              <w:rPr>
-                <w:sz w:val="18"/>
-              </w:rPr>
-              <w:t>Y</w:t>
-            </w:r>
-          </w:p>
-        </w:tc>
-        <w:tc>
-          <w:tcPr>
-            <w:tcW w:type="dxa" w:w="1984"/>
-          </w:tcPr>
-          <w:p>
-            <w:r/>
-            <w:r>
-              <w:rPr>
-                <w:sz w:val="18"/>
-              </w:rPr>
-              <w:t>-</w:t>
-            </w:r>
-          </w:p>
-        </w:tc>
-        <w:tc>
-          <w:tcPr>
-            <w:tcW w:type="dxa" w:w="3118"/>
-          </w:tcPr>
-          <w:p>
-            <w:r/>
-            <w:r>
-              <w:rPr>
-                <w:sz w:val="18"/>
-              </w:rPr>
-              <w:t>주문 유형별 상세 통계다.</w:t>
-            </w:r>
-          </w:p>
-        </w:tc>
-      </w:tr>
-      <w:tr>
-        <w:tc>
-          <w:tcPr>
-            <w:tcW w:type="dxa" w:w="2268"/>
-            <w:shd w:val="clear" w:color="auto" w:fill="F5F7FA"/>
-          </w:tcPr>
-          <w:p>
-            <w:r/>
-            <w:r>
-              <w:rPr>
-                <w:sz w:val="18"/>
-              </w:rPr>
-              <w:t>memberAnalytics</w:t>
-            </w:r>
-          </w:p>
-        </w:tc>
-        <w:tc>
-          <w:tcPr>
-            <w:tcW w:type="dxa" w:w="1417"/>
-            <w:shd w:val="clear" w:color="auto" w:fill="F5F7FA"/>
-          </w:tcPr>
-          <w:p>
-            <w:r/>
-            <w:r>
-              <w:rPr>
-                <w:sz w:val="18"/>
-              </w:rPr>
-              <w:t>JSON</w:t>
-            </w:r>
-          </w:p>
-        </w:tc>
-        <w:tc>
-          <w:tcPr>
-            <w:tcW w:type="dxa" w:w="850"/>
-            <w:shd w:val="clear" w:color="auto" w:fill="F5F7FA"/>
-          </w:tcPr>
-          <w:p>
-            <w:r/>
-            <w:r>
-              <w:rPr>
-                <w:sz w:val="18"/>
-              </w:rPr>
-              <w:t>Y</w:t>
-            </w:r>
-          </w:p>
-        </w:tc>
-        <w:tc>
-          <w:tcPr>
-            <w:tcW w:type="dxa" w:w="1984"/>
-            <w:shd w:val="clear" w:color="auto" w:fill="F5F7FA"/>
-          </w:tcPr>
-          <w:p>
-            <w:r/>
-            <w:r>
-              <w:rPr>
-                <w:sz w:val="18"/>
-              </w:rPr>
-              <w:t>-</w:t>
-            </w:r>
-          </w:p>
-        </w:tc>
-        <w:tc>
-          <w:tcPr>
-            <w:tcW w:type="dxa" w:w="3118"/>
-            <w:shd w:val="clear" w:color="auto" w:fill="F5F7FA"/>
-          </w:tcPr>
-          <w:p>
-            <w:r/>
-            <w:r>
-              <w:rPr>
-                <w:sz w:val="18"/>
-              </w:rPr>
-              <w:t>회원 등급/가입/이탈 분석 데이터다.</w:t>
-            </w:r>
-          </w:p>
-        </w:tc>
-      </w:tr>
-      <w:tr>
-        <w:tc>
-          <w:tcPr>
-            <w:tcW w:type="dxa" w:w="2268"/>
-          </w:tcPr>
-          <w:p>
-            <w:r/>
-            <w:r>
-              <w:rPr>
-                <w:sz w:val="18"/>
-              </w:rPr>
-              <w:t>marketingPerformance</w:t>
-            </w:r>
-          </w:p>
-        </w:tc>
-        <w:tc>
-          <w:tcPr>
-            <w:tcW w:type="dxa" w:w="1417"/>
-          </w:tcPr>
-          <w:p>
-            <w:r/>
-            <w:r>
-              <w:rPr>
-                <w:sz w:val="18"/>
-              </w:rPr>
-              <w:t>JSON</w:t>
-            </w:r>
-          </w:p>
-        </w:tc>
-        <w:tc>
-          <w:tcPr>
-            <w:tcW w:type="dxa" w:w="850"/>
-          </w:tcPr>
-          <w:p>
-            <w:r/>
-            <w:r>
-              <w:rPr>
-                <w:sz w:val="18"/>
-              </w:rPr>
-              <w:t>Y</w:t>
-            </w:r>
-          </w:p>
-        </w:tc>
-        <w:tc>
-          <w:tcPr>
-            <w:tcW w:type="dxa" w:w="1984"/>
-          </w:tcPr>
-          <w:p>
-            <w:r/>
-            <w:r>
-              <w:rPr>
-                <w:sz w:val="18"/>
-              </w:rPr>
-              <w:t>-</w:t>
-            </w:r>
-          </w:p>
-        </w:tc>
-        <w:tc>
-          <w:tcPr>
-            <w:tcW w:type="dxa" w:w="3118"/>
-          </w:tcPr>
-          <w:p>
-            <w:r/>
-            <w:r>
-              <w:rPr>
-                <w:sz w:val="18"/>
-              </w:rPr>
-              <w:t>쿠폰/할인/캠페인 성과 데이터다.</w:t>
+              <w:t>`GET /dashboard/marketing`</w:t>
+            </w:r>
+          </w:p>
+        </w:tc>
+        <w:tc>
+          <w:tcPr>
+            <w:tcW w:type="dxa" w:w="4819"/>
+          </w:tcPr>
+          <w:p>
+            <w:r/>
+            <w:r>
+              <w:rPr>
+                <w:sz w:val="18"/>
+              </w:rPr>
+              <w:t>배너/이벤트 성과</w:t>
             </w:r>
           </w:p>
         </w:tc>
@@ -1798,7 +2853,7 @@
         <w:rPr>
           <w:sz w:val="20"/>
         </w:rPr>
-        <w:t>엑셀 다운로드는 서버사이드에서 집계 데이터를 생성하여 클라이언트에서 `downloadDashboardExcel` 유틸로 변환한다.</w:t>
+        <w:t>페이지 진입 시 `usePageViewLog`로 접속 이력을 자동 기록한다.</w:t>
       </w:r>
     </w:p>
     <w:p>
@@ -1809,7 +2864,7 @@
         <w:rPr>
           <w:sz w:val="20"/>
         </w:rPr>
-        <w:t>페이지 진입 시 `usePageViewLog`로 접속 이력을 자동 기록한다.</w:t>
+        <w:t>모든 통계 컴포넌트는 서비스 레이어를 통해 데이터를 조회하며, 컴포넌트 내 하드코딩 데이터를 사용하지 않는다.</w:t>
       </w:r>
     </w:p>
     <w:p>
@@ -1844,17 +2899,6 @@
     </w:p>
     <w:p>
       <w:pPr>
-        <w:pStyle w:val="ListBullet"/>
-      </w:pPr>
-      <w:r>
-        <w:rPr>
-          <w:sz w:val="20"/>
-        </w:rPr>
-        <w:t>엑셀 다운로드 — 서버사이드 집계 데이터 생성 후 클라이언트에서 Excel 변환한다. 대량 데이터 시 서버에서 직접 Excel 생성 후 S3 업로드를 권장한다.</w:t>
-      </w:r>
-    </w:p>
-    <w:p>
-      <w:pPr>
         <w:pStyle w:val="Heading2"/>
       </w:pPr>
       <w:r>
@@ -2163,7 +3207,7 @@
               <w:rPr>
                 <w:sz w:val="18"/>
               </w:rPr>
-              <w:t>통계 카드(오늘 매출/주문/신규회원/미답변문의) 로드</w:t>
+              <w:t>`useDashboard` → StatCard 4개 + InfoCard 3개 로드</w:t>
             </w:r>
           </w:p>
         </w:tc>
@@ -2178,7 +3222,7 @@
               <w:rPr>
                 <w:sz w:val="18"/>
               </w:rPr>
-              <w:t>실시간 데이터</w:t>
+              <w:t>모든 값 서비스 연동 확인</w:t>
             </w:r>
           </w:p>
         </w:tc>
@@ -2208,7 +3252,7 @@
               <w:rPr>
                 <w:sz w:val="18"/>
               </w:rPr>
-              <w:t>차트 영역 확인</w:t>
+              <w:t>기간 필터 변경 (최근 7일)</w:t>
             </w:r>
           </w:p>
         </w:tc>
@@ -2222,7 +3266,7 @@
               <w:rPr>
                 <w:sz w:val="18"/>
               </w:rPr>
-              <w:t>최근 7일/30일 매출 추이 차트 렌더링</w:t>
+              <w:t>통계/일별매출 자동 재조회</w:t>
             </w:r>
           </w:p>
         </w:tc>
@@ -2236,7 +3280,7 @@
               <w:rPr>
                 <w:sz w:val="18"/>
               </w:rPr>
-              <w:t>기간 토글</w:t>
+              <w:t>DailySalesChart 기간 반영</w:t>
             </w:r>
           </w:p>
         </w:tc>
@@ -2268,7 +3312,7 @@
               <w:rPr>
                 <w:sz w:val="18"/>
               </w:rPr>
-              <w:t>최근 주문 목록 확인</w:t>
+              <w:t>주문 상세 탭 전환</w:t>
             </w:r>
           </w:p>
         </w:tc>
@@ -2283,7 +3327,7 @@
               <w:rPr>
                 <w:sz w:val="18"/>
               </w:rPr>
-              <w:t>최근 10건 주문 간략 목록</w:t>
+              <w:t>`useOrderDetails` → 유형/채널/결제/회원 데이터 표시</w:t>
             </w:r>
           </w:p>
         </w:tc>
@@ -2298,7 +3342,7 @@
               <w:rPr>
                 <w:sz w:val="18"/>
               </w:rPr>
-              <w:t>행 클릭 → 주문 상세 이동</w:t>
+              <w:t>탭별 데이터 변경</w:t>
             </w:r>
           </w:p>
         </w:tc>
@@ -2328,7 +3372,7 @@
               <w:rPr>
                 <w:sz w:val="18"/>
               </w:rPr>
-              <w:t>미처리 항목 알림 확인</w:t>
+              <w:t>회원 분석 확인</w:t>
             </w:r>
           </w:p>
         </w:tc>
@@ -2342,7 +3386,7 @@
               <w:rPr>
                 <w:sz w:val="18"/>
               </w:rPr>
-              <w:t>승인대기/미답변문의 카운트 Badge</w:t>
+              <w:t>`useMemberAnalytics` → 요약/성별/연령/등급/Top5 표시</w:t>
             </w:r>
           </w:p>
         </w:tc>
@@ -2356,7 +3400,127 @@
               <w:rPr>
                 <w:sz w:val="18"/>
               </w:rPr>
-              <w:t>클릭 → 해당 페이지 이동</w:t>
+              <w:t>하드코딩 없음 확인</w:t>
+            </w:r>
+          </w:p>
+        </w:tc>
+      </w:tr>
+      <w:tr>
+        <w:tc>
+          <w:tcPr>
+            <w:tcW w:type="dxa" w:w="2268"/>
+            <w:shd w:val="clear" w:color="auto" w:fill="F5F7FA"/>
+          </w:tcPr>
+          <w:p>
+            <w:r/>
+            <w:r>
+              <w:rPr>
+                <w:sz w:val="18"/>
+              </w:rPr>
+              <w:t>5</w:t>
+            </w:r>
+          </w:p>
+        </w:tc>
+        <w:tc>
+          <w:tcPr>
+            <w:tcW w:type="dxa" w:w="1701"/>
+            <w:shd w:val="clear" w:color="auto" w:fill="F5F7FA"/>
+          </w:tcPr>
+          <w:p>
+            <w:r/>
+            <w:r>
+              <w:rPr>
+                <w:sz w:val="18"/>
+              </w:rPr>
+              <w:t>매출현황 "주문내역 확인하러 가기" 클릭</w:t>
+            </w:r>
+          </w:p>
+        </w:tc>
+        <w:tc>
+          <w:tcPr>
+            <w:tcW w:type="dxa" w:w="850"/>
+            <w:shd w:val="clear" w:color="auto" w:fill="F5F7FA"/>
+          </w:tcPr>
+          <w:p>
+            <w:r/>
+            <w:r>
+              <w:rPr>
+                <w:sz w:val="18"/>
+              </w:rPr>
+              <w:t>`/orders`로 이동</w:t>
+            </w:r>
+          </w:p>
+        </w:tc>
+        <w:tc>
+          <w:tcPr>
+            <w:tcW w:type="dxa" w:w="4819"/>
+            <w:shd w:val="clear" w:color="auto" w:fill="F5F7FA"/>
+          </w:tcPr>
+          <w:p>
+            <w:r/>
+            <w:r>
+              <w:rPr>
+                <w:sz w:val="18"/>
+              </w:rPr>
+              <w:t>라우트 정상 이동</w:t>
+            </w:r>
+          </w:p>
+        </w:tc>
+      </w:tr>
+      <w:tr>
+        <w:tc>
+          <w:tcPr>
+            <w:tcW w:type="dxa" w:w="2268"/>
+          </w:tcPr>
+          <w:p>
+            <w:r/>
+            <w:r>
+              <w:rPr>
+                <w:sz w:val="18"/>
+              </w:rPr>
+              <w:t>6</w:t>
+            </w:r>
+          </w:p>
+        </w:tc>
+        <w:tc>
+          <w:tcPr>
+            <w:tcW w:type="dxa" w:w="1701"/>
+          </w:tcPr>
+          <w:p>
+            <w:r/>
+            <w:r>
+              <w:rPr>
+                <w:sz w:val="18"/>
+              </w:rPr>
+              <w:t>문의현황 "1:1 문의 확인하러 가기" 클릭</w:t>
+            </w:r>
+          </w:p>
+        </w:tc>
+        <w:tc>
+          <w:tcPr>
+            <w:tcW w:type="dxa" w:w="850"/>
+          </w:tcPr>
+          <w:p>
+            <w:r/>
+            <w:r>
+              <w:rPr>
+                <w:sz w:val="18"/>
+              </w:rPr>
+              <w:t>`/support`로 이동</w:t>
+            </w:r>
+          </w:p>
+        </w:tc>
+        <w:tc>
+          <w:tcPr>
+            <w:tcW w:type="dxa" w:w="4819"/>
+          </w:tcPr>
+          <w:p>
+            <w:r/>
+            <w:r>
+              <w:rPr>
+                <w:sz w:val="18"/>
+              </w:rPr>
+              <w:t>라우트 정상 이동</w:t>
             </w:r>
           </w:p>
         </w:tc>
@@ -2474,21 +3638,37 @@
         <w:br/>
         <w:t xml:space="preserve">  "data": {</w:t>
         <w:br/>
-        <w:t xml:space="preserve">    "totalProducts": 1024,</w:t>
+        <w:t xml:space="preserve">    "totalProducts": 1284,</w:t>
         <w:br/>
-        <w:t xml:space="preserve">    "todayOrders": 1250,</w:t>
+        <w:t xml:space="preserve">    "todayOrders": 156,</w:t>
         <w:br/>
-        <w:t xml:space="preserve">    "todayRevenue": 24500000,</w:t>
+        <w:t xml:space="preserve">    "todayRevenue": 4850000,</w:t>
         <w:br/>
-        <w:t xml:space="preserve">    "totalStores": 18,</w:t>
+        <w:t xml:space="preserve">    "todayCompletedRevenue": 2910000,</w:t>
         <w:br/>
-        <w:t xml:space="preserve">    "yesterdayOrders": 1100,</w:t>
+        <w:t xml:space="preserve">    "todayCancelledRevenue": 485000,</w:t>
         <w:br/>
-        <w:t xml:space="preserve">    "yesterdayRevenue": 22000000,</w:t>
+        <w:t xml:space="preserve">    "totalStores": 89,</w:t>
         <w:br/>
-        <w:t xml:space="preserve">    "ordersChange": 13.6,</w:t>
+        <w:t xml:space="preserve">    "yesterdayOrders": 142,</w:t>
         <w:br/>
-        <w:t xml:space="preserve">    "revenueChange": 11.3</w:t>
+        <w:t xml:space="preserve">    "yesterdayRevenue": 4320000,</w:t>
+        <w:br/>
+        <w:t xml:space="preserve">    "ordersChange": 9.86,</w:t>
+        <w:br/>
+        <w:t xml:space="preserve">    "revenueChange": 12.27,</w:t>
+        <w:br/>
+        <w:t xml:space="preserve">    "totalMembers": 88000,</w:t>
+        <w:br/>
+        <w:t xml:space="preserve">    "newSignupNormal": 80,</w:t>
+        <w:br/>
+        <w:t xml:space="preserve">    "newSignupSimple": 60,</w:t>
+        <w:br/>
+        <w:t xml:space="preserve">    "withdrawalCount": 8,</w:t>
+        <w:br/>
+        <w:t xml:space="preserve">    "pendingInquiries": 80,</w:t>
+        <w:br/>
+        <w:t xml:space="preserve">    "resolvedInquiries": 8</w:t>
         <w:br/>
         <w:t xml:space="preserve">  }</w:t>
         <w:br/>
@@ -2500,7 +3680,183 @@
         <w:pStyle w:val="Heading3"/>
       </w:pPr>
       <w:r>
-        <w:t>10-2. 마케팅 성과 조회</w:t>
+        <w:t>10-2. 주문 상세 분석</w:t>
+      </w:r>
+    </w:p>
+    <w:p>
+      <w:pPr>
+        <w:shd w:val="clear" w:color="auto" w:fill="F0F0F0"/>
+      </w:pPr>
+      <w:r>
+        <w:rPr>
+          <w:rFonts w:ascii="Consolas" w:hAnsi="Consolas"/>
+          <w:color w:val="333333"/>
+          <w:sz w:val="16"/>
+        </w:rPr>
+        <w:t>GET /dashboard/order-details</w:t>
+      </w:r>
+    </w:p>
+    <w:p>
+      <w:r>
+        <w:rPr>
+          <w:sz w:val="20"/>
+        </w:rPr>
+        <w:t>Response `200 OK`</w:t>
+      </w:r>
+    </w:p>
+    <w:p>
+      <w:pPr>
+        <w:shd w:val="clear" w:color="auto" w:fill="F0F0F0"/>
+      </w:pPr>
+      <w:r>
+        <w:rPr>
+          <w:rFonts w:ascii="Consolas" w:hAnsi="Consolas"/>
+          <w:color w:val="333333"/>
+          <w:sz w:val="16"/>
+        </w:rPr>
+        <w:t>{</w:t>
+        <w:br/>
+        <w:t xml:space="preserve">  "data": {</w:t>
+        <w:br/>
+        <w:t xml:space="preserve">    "byType": [{ "label": "배달", "value": 55, "count": 1560 }, { "label": "포장", "value": 35, "count": 992 }, { "label": "매장식사", "value": 10, "count": 283 }],</w:t>
+        <w:br/>
+        <w:t xml:space="preserve">    "byChannel": [{ "label": "앱", "value": 52, "count": 1474 }, { "label": "키오스크", "value": 22, "count": 623 }, { "label": "POS", "value": 15, "count": 425 }, { "label": "웹", "value": 11, "count": 312 }],</w:t>
+        <w:br/>
+        <w:t xml:space="preserve">    "byPayment": [{ "label": "카드", "value": 48, "count": 1360 }, { "label": "카카오페이", "value": 20, "count": 567 }],</w:t>
+        <w:br/>
+        <w:t xml:space="preserve">    "byMember": [{ "label": "회원", "value": 85, "count": 2409 }]</w:t>
+        <w:br/>
+        <w:t xml:space="preserve">  }</w:t>
+        <w:br/>
+        <w:t>}</w:t>
+      </w:r>
+    </w:p>
+    <w:p>
+      <w:pPr>
+        <w:pStyle w:val="Heading3"/>
+      </w:pPr>
+      <w:r>
+        <w:t>10-3. 일별 매출 조회</w:t>
+      </w:r>
+    </w:p>
+    <w:p>
+      <w:pPr>
+        <w:shd w:val="clear" w:color="auto" w:fill="F0F0F0"/>
+      </w:pPr>
+      <w:r>
+        <w:rPr>
+          <w:rFonts w:ascii="Consolas" w:hAnsi="Consolas"/>
+          <w:color w:val="333333"/>
+          <w:sz w:val="16"/>
+        </w:rPr>
+        <w:t>GET /dashboard/daily-sales</w:t>
+      </w:r>
+    </w:p>
+    <w:p>
+      <w:r>
+        <w:rPr>
+          <w:sz w:val="20"/>
+        </w:rPr>
+        <w:t>Query Parameters: `preset`, `from`, `to`</w:t>
+      </w:r>
+    </w:p>
+    <w:p>
+      <w:r>
+        <w:rPr>
+          <w:sz w:val="20"/>
+        </w:rPr>
+        <w:t>Response `200 OK`</w:t>
+      </w:r>
+    </w:p>
+    <w:p>
+      <w:pPr>
+        <w:shd w:val="clear" w:color="auto" w:fill="F0F0F0"/>
+      </w:pPr>
+      <w:r>
+        <w:rPr>
+          <w:rFonts w:ascii="Consolas" w:hAnsi="Consolas"/>
+          <w:color w:val="333333"/>
+          <w:sz w:val="16"/>
+        </w:rPr>
+        <w:t>{</w:t>
+        <w:br/>
+        <w:t xml:space="preserve">  "data": [</w:t>
+        <w:br/>
+        <w:t xml:space="preserve">    { "date": "2026-03-10", "revenue": 1050000, "orders": 85, "avgOrderAmount": 12350 }</w:t>
+        <w:br/>
+        <w:t xml:space="preserve">  ]</w:t>
+        <w:br/>
+        <w:t>}</w:t>
+      </w:r>
+    </w:p>
+    <w:p>
+      <w:pPr>
+        <w:pStyle w:val="Heading3"/>
+      </w:pPr>
+      <w:r>
+        <w:t>10-4. 회원 분석 조회</w:t>
+      </w:r>
+    </w:p>
+    <w:p>
+      <w:pPr>
+        <w:shd w:val="clear" w:color="auto" w:fill="F0F0F0"/>
+      </w:pPr>
+      <w:r>
+        <w:rPr>
+          <w:rFonts w:ascii="Consolas" w:hAnsi="Consolas"/>
+          <w:color w:val="333333"/>
+          <w:sz w:val="16"/>
+        </w:rPr>
+        <w:t>GET /dashboard/member-analytics</w:t>
+      </w:r>
+    </w:p>
+    <w:p>
+      <w:r>
+        <w:rPr>
+          <w:sz w:val="20"/>
+        </w:rPr>
+        <w:t>Response `200 OK`</w:t>
+      </w:r>
+    </w:p>
+    <w:p>
+      <w:pPr>
+        <w:shd w:val="clear" w:color="auto" w:fill="F0F0F0"/>
+      </w:pPr>
+      <w:r>
+        <w:rPr>
+          <w:rFonts w:ascii="Consolas" w:hAnsi="Consolas"/>
+          <w:color w:val="333333"/>
+          <w:sz w:val="16"/>
+        </w:rPr>
+        <w:t>{</w:t>
+        <w:br/>
+        <w:t xml:space="preserve">  "data": {</w:t>
+        <w:br/>
+        <w:t xml:space="preserve">    "summary": { "total": 88000, "active": 62500, "dormant": 18200, "newSignup": 140, "withdrawal": 8 },</w:t>
+        <w:br/>
+        <w:t xml:space="preserve">    "gender": [{ "label": "여성", "value": 52.3, "count": 46024 }],</w:t>
+        <w:br/>
+        <w:t xml:space="preserve">    "age": [{ "range": "20대", "percentage": 28.5, "count": 25080 }],</w:t>
+        <w:br/>
+        <w:t xml:space="preserve">    "membership": [{ "grade": "VIP", "count": 2640, "percentage": 3.0 }],</w:t>
+        <w:br/>
+        <w:t xml:space="preserve">    "growth": { "newCustomerRate": 18.5, "monthlyNewAvg": 4200, "monthlyChurnAvg": 380 },</w:t>
+        <w:br/>
+        <w:t xml:space="preserve">    "topCustomers": [{ "rank": 1, "name": "김**", "totalOrders": 142, "totalAmount": 4250000, "grade": "VIP" }],</w:t>
+        <w:br/>
+        <w:t xml:space="preserve">    "orderFrequency": [{ "label": "주문 1회", "percentage": 35.2, "count": 30976 }]</w:t>
+        <w:br/>
+        <w:t xml:space="preserve">  }</w:t>
+        <w:br/>
+        <w:t>}</w:t>
+      </w:r>
+    </w:p>
+    <w:p>
+      <w:pPr>
+        <w:pStyle w:val="Heading3"/>
+      </w:pPr>
+      <w:r>
+        <w:t>10-5. 마케팅 성과 조회</w:t>
       </w:r>
     </w:p>
     <w:p>
@@ -2592,83 +3948,7 @@
         <w:pStyle w:val="Heading3"/>
       </w:pPr>
       <w:r>
-        <w:t>10-3. 대시보드 데이터 엑셀 내보내기</w:t>
-      </w:r>
-    </w:p>
-    <w:p>
-      <w:pPr>
-        <w:shd w:val="clear" w:color="auto" w:fill="F0F0F0"/>
-      </w:pPr>
-      <w:r>
-        <w:rPr>
-          <w:rFonts w:ascii="Consolas" w:hAnsi="Consolas"/>
-          <w:color w:val="333333"/>
-          <w:sz w:val="16"/>
-        </w:rPr>
-        <w:t>GET /dashboard/export</w:t>
-      </w:r>
-    </w:p>
-    <w:p>
-      <w:r>
-        <w:rPr>
-          <w:sz w:val="20"/>
-        </w:rPr>
-        <w:t>Query Parameters: `preset`, `from`, `to`</w:t>
-      </w:r>
-    </w:p>
-    <w:p>
-      <w:r>
-        <w:rPr>
-          <w:sz w:val="20"/>
-        </w:rPr>
-        <w:t>Response `200 OK`</w:t>
-      </w:r>
-    </w:p>
-    <w:p>
-      <w:pPr>
-        <w:shd w:val="clear" w:color="auto" w:fill="F0F0F0"/>
-      </w:pPr>
-      <w:r>
-        <w:rPr>
-          <w:rFonts w:ascii="Consolas" w:hAnsi="Consolas"/>
-          <w:color w:val="333333"/>
-          <w:sz w:val="16"/>
-        </w:rPr>
-        <w:t>{</w:t>
-        <w:br/>
-        <w:t xml:space="preserve">  "data": {</w:t>
-        <w:br/>
-        <w:t xml:space="preserve">    "stats": { ... },</w:t>
-        <w:br/>
-        <w:t xml:space="preserve">    "dailySales": [</w:t>
-        <w:br/>
-        <w:t xml:space="preserve">      {</w:t>
-        <w:br/>
-        <w:t xml:space="preserve">        "date": "2026-03-10",</w:t>
-        <w:br/>
-        <w:t xml:space="preserve">        "revenue": 1050000,</w:t>
-        <w:br/>
-        <w:t xml:space="preserve">        "orders": 85,</w:t>
-        <w:br/>
-        <w:t xml:space="preserve">        "avgOrderAmount": 12350</w:t>
-        <w:br/>
-        <w:t xml:space="preserve">      }</w:t>
-        <w:br/>
-        <w:t xml:space="preserve">    ],</w:t>
-        <w:br/>
-        <w:t xml:space="preserve">    "marketing": [ ... ]</w:t>
-        <w:br/>
-        <w:t xml:space="preserve">  }</w:t>
-        <w:br/>
-        <w:t>}</w:t>
-      </w:r>
-    </w:p>
-    <w:p>
-      <w:pPr>
-        <w:pStyle w:val="Heading3"/>
-      </w:pPr>
-      <w:r>
-        <w:t>10-4. 상태 변경 감사(Audit) 로그</w:t>
+        <w:t>10-6. 상태 변경 감사(Audit) 로그</w:t>
       </w:r>
     </w:p>
     <w:p>

</xml_diff>